<commit_message>
Update resume: add STARS publications, ELO 2026 talk, and STARS links
Adds a STARS Digital Repository publications section, the ELO 2026
(Un)Supervised Conference talk, STARS archive links for both
presentations, and the 2024 Summer Mentoring Fellowship.

Co-Authored-By: Claude Opus 5.5 <noreply@anthropic.com>
Claude-Session: https://claude.ai/code/session_011TbAgz65A3s71tFxu6RsYo
</commit_message>
<xml_diff>
--- a/Angely Suarez Resume 2026.docx
+++ b/Angely Suarez Resume 2026.docx
@@ -37,51 +37,7 @@
           <w:sz w:val="20"/>
           <w:szCs w:val="20"/>
         </w:rPr>
-        <w:t xml:space="preserve">Kissimmee, </w:t>
-      </w:r>
-      <w:proofErr w:type="gramStart"/>
-      <w:r>
-        <w:rPr>
-          <w:rFonts w:ascii="Arial Narrow" w:hAnsi="Arial Narrow"/>
-          <w:sz w:val="20"/>
-          <w:szCs w:val="20"/>
-        </w:rPr>
-        <w:t>FL  •</w:t>
-      </w:r>
-      <w:proofErr w:type="gramEnd"/>
-      <w:r>
-        <w:rPr>
-          <w:rFonts w:ascii="Arial Narrow" w:hAnsi="Arial Narrow"/>
-          <w:sz w:val="20"/>
-          <w:szCs w:val="20"/>
-        </w:rPr>
-        <w:t xml:space="preserve">  </w:t>
-      </w:r>
-      <w:proofErr w:type="gramStart"/>
-      <w:r>
-        <w:rPr>
-          <w:rFonts w:ascii="Arial Narrow" w:hAnsi="Arial Narrow"/>
-          <w:sz w:val="20"/>
-          <w:szCs w:val="20"/>
-        </w:rPr>
-        <w:t>acsuarez84@hotmail.com</w:t>
-      </w:r>
-      <w:r>
-        <w:rPr>
-          <w:rFonts w:ascii="Arial Narrow" w:hAnsi="Arial Narrow"/>
-          <w:sz w:val="20"/>
-          <w:szCs w:val="20"/>
-        </w:rPr>
-        <w:t xml:space="preserve">  •</w:t>
-      </w:r>
-      <w:proofErr w:type="gramEnd"/>
-      <w:r>
-        <w:rPr>
-          <w:rFonts w:ascii="Arial Narrow" w:hAnsi="Arial Narrow"/>
-          <w:sz w:val="20"/>
-          <w:szCs w:val="20"/>
-        </w:rPr>
-        <w:t xml:space="preserve">  github.com/acsuarez84  </w:t>
+        <w:t xml:space="preserve">Kissimmee, FL  •  acsuarez84@hotmail.com  •  github.com/acsuarez84  </w:t>
       </w:r>
     </w:p>
     <w:p>
@@ -132,33 +88,7 @@
         <w:rPr>
           <w:rFonts w:ascii="Arial Narrow" w:hAnsi="Arial Narrow"/>
         </w:rPr>
-        <w:t>PhD student in Text &amp; Technology at the University of Central Florida and graduate Research Assistant on a UCF–Ah-Tah-</w:t>
-      </w:r>
-      <w:proofErr w:type="spellStart"/>
-      <w:r>
-        <w:rPr>
-          <w:rFonts w:ascii="Arial Narrow" w:hAnsi="Arial Narrow"/>
-        </w:rPr>
-        <w:t>Thi</w:t>
-      </w:r>
-      <w:proofErr w:type="spellEnd"/>
-      <w:r>
-        <w:rPr>
-          <w:rFonts w:ascii="Arial Narrow" w:hAnsi="Arial Narrow"/>
-        </w:rPr>
-        <w:t xml:space="preserve">-Ki Museum digital archives project. Hands-on experience with large language model evaluation, interactive digital artifacts built via AI-assisted coding workflows, and the structuring of unstructured textual data. Research interests center on the intersection of language, large-language models, and computational text analysis. Brings a decade of leadership across instruction, research, and cross-functional operations, with a documented track record of rapidly absorbing new domains and translating complex material for diverse stakeholders. Actively building </w:t>
-      </w:r>
-      <w:r>
-        <w:rPr>
-          <w:rFonts w:ascii="Arial Narrow" w:hAnsi="Arial Narrow"/>
-        </w:rPr>
-        <w:t xml:space="preserve">HTML, CSS, JavaScript, P5.js </w:t>
-      </w:r>
-      <w:r>
-        <w:rPr>
-          <w:rFonts w:ascii="Arial Narrow" w:hAnsi="Arial Narrow"/>
-        </w:rPr>
-        <w:t>foundations through doctoral coursework and self-directed study.</w:t>
+        <w:t xml:space="preserve">PhD student in Text &amp; Technology at the University of Central Florida and graduate Research Assistant on a UCF–Ah-Tah-Thi-Ki Museum digital archives project. Hands-on experience with large language model evaluation, interactive digital artifacts built via AI-assisted coding workflows, and the structuring of unstructured textual data. Research interests center on the intersection of language, large-language models, and computational text analysis. Brings a decade of leadership across instruction, research, and cross-functional operations, with a documented track record of rapidly absorbing new domains and translating complex material for diverse stakeholders. Actively building HTML, CSS, JavaScript, P5.js foundations through doctoral coursework and self-directed study.</w:t>
       </w:r>
     </w:p>
     <w:p>
@@ -503,21 +433,7 @@
         <w:rPr>
           <w:rFonts w:ascii="Arial Narrow" w:hAnsi="Arial Narrow"/>
         </w:rPr>
-        <w:t xml:space="preserve"> Designed and conducted a comparative case study of three large language models (</w:t>
-      </w:r>
-      <w:proofErr w:type="spellStart"/>
-      <w:r>
-        <w:rPr>
-          <w:rFonts w:ascii="Arial Narrow" w:hAnsi="Arial Narrow"/>
-        </w:rPr>
-        <w:t>Translinguo</w:t>
-      </w:r>
-      <w:proofErr w:type="spellEnd"/>
-      <w:r>
-        <w:rPr>
-          <w:rFonts w:ascii="Arial Narrow" w:hAnsi="Arial Narrow"/>
-        </w:rPr>
-        <w:t>, ChatGPT, Claude) on visual interpretation tasks with explicit authorial context, surfacing differences in how each system honors or overrides user-provided framing.</w:t>
+        <w:t xml:space="preserve"> Designed and conducted a comparative case study of three large language models (Translinguo, ChatGPT, Claude) on visual interpretation tasks with explicit authorial context, surfacing differences in how each system honors or overrides user-provided framing.</w:t>
       </w:r>
     </w:p>
     <w:p>
@@ -744,21 +660,7 @@
         <w:rPr>
           <w:rFonts w:ascii="Arial Narrow" w:hAnsi="Arial Narrow"/>
         </w:rPr>
-        <w:t xml:space="preserve"> — Autoethnographic comparative case study of how </w:t>
-      </w:r>
-      <w:proofErr w:type="spellStart"/>
-      <w:r>
-        <w:rPr>
-          <w:rFonts w:ascii="Arial Narrow" w:hAnsi="Arial Narrow"/>
-        </w:rPr>
-        <w:t>Translinguo</w:t>
-      </w:r>
-      <w:proofErr w:type="spellEnd"/>
-      <w:r>
-        <w:rPr>
-          <w:rFonts w:ascii="Arial Narrow" w:hAnsi="Arial Narrow"/>
-        </w:rPr>
-        <w:t>, ChatGPT, and Claude interpret a photograph when supplied with explicit authorial framework (Context, Abstraction, Concept). Findings rendered as an interactive HTML/JavaScript concept map with citation infrastructure.</w:t>
+        <w:t xml:space="preserve"> — Autoethnographic comparative case study of how Translinguo, ChatGPT, and Claude interpret a photograph when supplied with explicit authorial framework (Context, Abstraction, Concept). Findings rendered as an interactive HTML/JavaScript concept map with citation infrastructure.</w:t>
       </w:r>
     </w:p>
     <w:p>
@@ -834,43 +736,19 @@
           <w:rFonts w:ascii="Arial Narrow" w:hAnsi="Arial Narrow"/>
         </w:rPr>
       </w:pPr>
-      <w:proofErr w:type="spellStart"/>
-      <w:r>
-        <w:rPr>
-          <w:rFonts w:ascii="Arial Narrow" w:hAnsi="Arial Narrow"/>
-          <w:b/>
-          <w:bCs/>
-        </w:rPr>
-        <w:t>AgenticDemoing</w:t>
-      </w:r>
-      <w:proofErr w:type="spellEnd"/>
-      <w:r>
-        <w:rPr>
-          <w:rFonts w:ascii="Arial Narrow" w:hAnsi="Arial Narrow"/>
-          <w:b/>
-          <w:bCs/>
-        </w:rPr>
-        <w:t xml:space="preserve"> </w:t>
-      </w:r>
-      <w:r>
-        <w:rPr>
-          <w:rFonts w:ascii="Arial Narrow" w:hAnsi="Arial Narrow"/>
-        </w:rPr>
-        <w:t>— GitHub Repository — Public GitHub Pages repository (github.com/acsuarez84/</w:t>
-      </w:r>
-      <w:proofErr w:type="spellStart"/>
-      <w:r>
-        <w:rPr>
-          <w:rFonts w:ascii="Arial Narrow" w:hAnsi="Arial Narrow"/>
-        </w:rPr>
-        <w:t>AgenticDemoing</w:t>
-      </w:r>
-      <w:proofErr w:type="spellEnd"/>
-      <w:r>
-        <w:rPr>
-          <w:rFonts w:ascii="Arial Narrow" w:hAnsi="Arial Narrow"/>
-        </w:rPr>
-        <w:t>) hosting digital humanities artifacts developed via AI-assisted coding workflows.</w:t>
+      <w:r>
+        <w:rPr>
+          <w:rFonts w:ascii="Arial Narrow" w:hAnsi="Arial Narrow"/>
+          <w:b/>
+          <w:bCs/>
+        </w:rPr>
+        <w:t xml:space="preserve">AgenticDemoing </w:t>
+      </w:r>
+      <w:r>
+        <w:rPr>
+          <w:rFonts w:ascii="Arial Narrow" w:hAnsi="Arial Narrow"/>
+        </w:rPr>
+        <w:t>— GitHub Repository — Public GitHub Pages repository (github.com/acsuarez84/AgenticDemoing) hosting digital humanities artifacts developed via AI-assisted coding workflows.</w:t>
       </w:r>
     </w:p>
     <w:p>
@@ -937,25 +815,7 @@
           <w:i/>
           <w:iCs/>
         </w:rPr>
-        <w:t>University of Central Florida — Ah-Tah-</w:t>
-      </w:r>
-      <w:proofErr w:type="spellStart"/>
-      <w:r>
-        <w:rPr>
-          <w:rFonts w:ascii="Arial Narrow" w:hAnsi="Arial Narrow"/>
-          <w:i/>
-          <w:iCs/>
-        </w:rPr>
-        <w:t>Thi</w:t>
-      </w:r>
-      <w:proofErr w:type="spellEnd"/>
-      <w:r>
-        <w:rPr>
-          <w:rFonts w:ascii="Arial Narrow" w:hAnsi="Arial Narrow"/>
-          <w:i/>
-          <w:iCs/>
-        </w:rPr>
-        <w:t>-Ki Museum Archival Project</w:t>
+        <w:t>University of Central Florida — Ah-Tah-Thi-Ki Museum Archival Project</w:t>
       </w:r>
     </w:p>
     <w:p>
@@ -1031,21 +891,7 @@
         <w:rPr>
           <w:rFonts w:ascii="Arial Narrow" w:hAnsi="Arial Narrow"/>
         </w:rPr>
-        <w:t>Partnering directly with tribal stakeholders at the Ah-Tah-</w:t>
-      </w:r>
-      <w:proofErr w:type="spellStart"/>
-      <w:r>
-        <w:rPr>
-          <w:rFonts w:ascii="Arial Narrow" w:hAnsi="Arial Narrow"/>
-        </w:rPr>
-        <w:t>Thi</w:t>
-      </w:r>
-      <w:proofErr w:type="spellEnd"/>
-      <w:r>
-        <w:rPr>
-          <w:rFonts w:ascii="Arial Narrow" w:hAnsi="Arial Narrow"/>
-        </w:rPr>
-        <w:t>-Ki Museum to align research methodology with community-defined principles of data sovereignty and ethical engagement.</w:t>
+        <w:t>Partnering directly with tribal stakeholders at the Ah-Tah-Thi-Ki Museum to align research methodology with community-defined principles of data sovereignty and ethical engagement.</w:t>
       </w:r>
     </w:p>
     <w:p>
@@ -1087,6 +933,109 @@
           <w:sz w:val="24"/>
           <w:szCs w:val="24"/>
         </w:rPr>
+        <w:t>PUBLICATIONS — STARS DIGITAL REPOSITORY, UCF LIBRARIES</w:t>
+      </w:r>
+    </w:p>
+    <w:p>
+      <w:pPr>
+        <w:pStyle w:val="ListParagraph"/>
+        <w:numPr>
+          <w:ilvl w:val="0"/>
+          <w:numId w:val="2"/>
+        </w:numPr>
+        <w:spacing w:after="60"/>
+        <w:rPr>
+          <w:rFonts w:ascii="Arial Narrow" w:hAnsi="Arial Narrow"/>
+        </w:rPr>
+      </w:pPr>
+      <w:r>
+        <w:rPr>
+          <w:rFonts w:ascii="Arial Narrow" w:hAnsi="Arial Narrow"/>
+        </w:rPr>
+        <w:t xml:space="preserve">Suarez DeJesus, A. C. (2026). </w:t>
+      </w:r>
+      <w:r>
+        <w:rPr>
+          <w:rFonts w:ascii="Arial Narrow" w:hAnsi="Arial Narrow"/>
+          <w:i/>
+          <w:iCs/>
+        </w:rPr>
+        <w:t xml:space="preserve">The Implications of Generative-AI User Prompt Engineering Shaping the Absent Presence of Latino Women Textual Rhetoric in LLMs</w:t>
+      </w:r>
+      <w:r>
+        <w:rPr>
+          <w:rFonts w:ascii="Arial Narrow" w:hAnsi="Arial Narrow"/>
+        </w:rPr>
+        <w:t xml:space="preserve"> [Conference presentation]. Electronic Literature Organization (ELO) 2026 (Un)Supervised Conference. STARS. https://stars.library.ucf.edu/elo2026/narrativesandworlds/schedule/23</w:t>
+      </w:r>
+    </w:p>
+    <w:p>
+      <w:pPr>
+        <w:pStyle w:val="ListParagraph"/>
+        <w:numPr>
+          <w:ilvl w:val="0"/>
+          <w:numId w:val="2"/>
+        </w:numPr>
+        <w:spacing w:after="60"/>
+        <w:rPr>
+          <w:rFonts w:ascii="Arial Narrow" w:hAnsi="Arial Narrow"/>
+        </w:rPr>
+      </w:pPr>
+      <w:r>
+        <w:rPr>
+          <w:rFonts w:ascii="Arial Narrow" w:hAnsi="Arial Narrow"/>
+        </w:rPr>
+        <w:t xml:space="preserve">Suarez DeJesus, A. C. (2026). </w:t>
+      </w:r>
+      <w:r>
+        <w:rPr>
+          <w:rFonts w:ascii="Arial Narrow" w:hAnsi="Arial Narrow"/>
+          <w:i/>
+          <w:iCs/>
+        </w:rPr>
+        <w:t xml:space="preserve">Generative AI Prompt Engineering as a Tool for Multilingual Learner Writing and Teacher Planning in the K-12 Classroom</w:t>
+      </w:r>
+      <w:r>
+        <w:rPr>
+          <w:rFonts w:ascii="Arial Narrow" w:hAnsi="Arial Narrow"/>
+        </w:rPr>
+        <w:t xml:space="preserve"> [Conference presentation]. </w:t>
+      </w:r>
+      <w:r>
+        <w:rPr>
+          <w:rFonts w:ascii="Arial Narrow" w:hAnsi="Arial Narrow"/>
+          <w:i/>
+          <w:iCs/>
+        </w:rPr>
+        <w:t xml:space="preserve">Teaching &amp; Learning with AI</w:t>
+      </w:r>
+      <w:r>
+        <w:rPr>
+          <w:rFonts w:ascii="Arial Narrow" w:hAnsi="Arial Narrow"/>
+        </w:rPr>
+        <w:t xml:space="preserve">, 11. University of Central Florida Library. STARS. https://stars.library.ucf.edu/teaching-and-learning-with-ai/11</w:t>
+      </w:r>
+    </w:p>
+    <w:p>
+      <w:pPr>
+        <w:pBdr>
+          <w:bottom w:val="single" w:sz="6" w:space="2" w:color="000000"/>
+        </w:pBdr>
+        <w:spacing w:before="240" w:after="80"/>
+        <w:rPr>
+          <w:rFonts w:ascii="Arial Narrow" w:hAnsi="Arial Narrow"/>
+          <w:b/>
+          <w:bCs/>
+        </w:rPr>
+      </w:pPr>
+      <w:r>
+        <w:rPr>
+          <w:rFonts w:ascii="Arial Narrow" w:hAnsi="Arial Narrow"/>
+          <w:b/>
+          <w:bCs/>
+          <w:sz w:val="24"/>
+          <w:szCs w:val="24"/>
+        </w:rPr>
         <w:t>CONFERENCE PRESENTATIONS</w:t>
       </w:r>
     </w:p>
@@ -1106,6 +1055,119 @@
           <w:b/>
           <w:bCs/>
         </w:rPr>
+        <w:t xml:space="preserve">Electronic Literature Organization (ELO) 2026 (Un)Supervised Conference — Online</w:t>
+      </w:r>
+      <w:r>
+        <w:rPr>
+          <w:rFonts w:ascii="Arial Narrow" w:hAnsi="Arial Narrow"/>
+        </w:rPr>
+        <w:tab/>
+        <w:t>July 16, 2026</w:t>
+      </w:r>
+    </w:p>
+    <w:p>
+      <w:pPr>
+        <w:spacing w:after="60"/>
+        <w:rPr>
+          <w:rFonts w:ascii="Arial Narrow" w:hAnsi="Arial Narrow"/>
+          <w:b/>
+          <w:bCs/>
+          <w:i/>
+          <w:iCs/>
+        </w:rPr>
+      </w:pPr>
+      <w:r>
+        <w:rPr>
+          <w:rFonts w:ascii="Arial Narrow" w:hAnsi="Arial Narrow"/>
+          <w:b/>
+          <w:bCs/>
+          <w:i/>
+          <w:iCs/>
+        </w:rPr>
+        <w:t xml:space="preserve">Peer-reviewed Individual Talk — Narratives &amp; Worlds Track</w:t>
+      </w:r>
+    </w:p>
+    <w:p>
+      <w:pPr>
+        <w:pStyle w:val="ListParagraph"/>
+        <w:numPr>
+          <w:ilvl w:val="0"/>
+          <w:numId w:val="4"/>
+        </w:numPr>
+        <w:spacing w:after="60"/>
+        <w:rPr>
+          <w:rFonts w:ascii="Arial Narrow" w:hAnsi="Arial Narrow"/>
+        </w:rPr>
+      </w:pPr>
+      <w:r>
+        <w:rPr>
+          <w:rFonts w:ascii="Arial Narrow" w:hAnsi="Arial Narrow"/>
+          <w:i/>
+          <w:iCs/>
+        </w:rPr>
+        <w:t xml:space="preserve">“The Implications of Generative-AI User Prompt Engineering Shaping the Absent Presence of Latino Women Textual Rhetoric in LLMs”</w:t>
+      </w:r>
+      <w:r>
+        <w:rPr>
+          <w:rFonts w:ascii="Arial Narrow" w:hAnsi="Arial Narrow"/>
+        </w:rPr>
+        <w:t xml:space="preserve"> — Analysis of narrative-prompt experiments across ChatGPT (3.5 and 5), Claude, Gemini, and Microsoft Copilot showing how LLM outputs persistently represent Latina characters through stereotyped tropes despite advances in model design.</w:t>
+      </w:r>
+    </w:p>
+    <w:p>
+      <w:pPr>
+        <w:pStyle w:val="ListParagraph"/>
+        <w:numPr>
+          <w:ilvl w:val="0"/>
+          <w:numId w:val="4"/>
+        </w:numPr>
+        <w:spacing w:after="60"/>
+        <w:rPr>
+          <w:rFonts w:ascii="Arial Narrow" w:hAnsi="Arial Narrow"/>
+        </w:rPr>
+      </w:pPr>
+      <w:r>
+        <w:rPr>
+          <w:rFonts w:ascii="Arial Narrow" w:hAnsi="Arial Narrow"/>
+        </w:rPr>
+        <w:t xml:space="preserve">Draws on Brock’s Critical Technocultural Discourse Analysis, White et al.’s prompt engineering framework, Klein’s computational spatiality, and Anzaldúa’s borderlands theory.</w:t>
+      </w:r>
+    </w:p>
+    <w:p>
+      <w:pPr>
+        <w:pStyle w:val="ListParagraph"/>
+        <w:numPr>
+          <w:ilvl w:val="0"/>
+          <w:numId w:val="4"/>
+        </w:numPr>
+        <w:spacing w:after="60"/>
+        <w:rPr>
+          <w:rFonts w:ascii="Arial Narrow" w:hAnsi="Arial Narrow"/>
+        </w:rPr>
+      </w:pPr>
+      <w:r>
+        <w:rPr>
+          <w:rFonts w:ascii="Arial Narrow" w:hAnsi="Arial Narrow"/>
+        </w:rPr>
+        <w:t xml:space="preserve">Archived in STARS: https://stars.library.ucf.edu/elo2026/narrativesandworlds/schedule/23</w:t>
+      </w:r>
+    </w:p>
+    <w:p>
+      <w:pPr>
+        <w:tabs>
+          <w:tab w:val="right" w:pos="9360"/>
+        </w:tabs>
+        <w:spacing w:before="120" w:after="20"/>
+        <w:rPr>
+          <w:rFonts w:ascii="Arial Narrow" w:hAnsi="Arial Narrow"/>
+        </w:rPr>
+      </w:pPr>
+      <w:r>
+        <w:rPr>
+          <w:rFonts w:ascii="Arial Narrow" w:hAnsi="Arial Narrow"/>
+          <w:b/>
+          <w:bCs/>
+        </w:rPr>
         <w:t>Teaching and Learning with AI Conference — University of Central Florida</w:t>
       </w:r>
       <w:r>
@@ -1158,21 +1220,7 @@
         <w:rPr>
           <w:rFonts w:ascii="Arial Narrow" w:hAnsi="Arial Narrow"/>
         </w:rPr>
-        <w:t xml:space="preserve"> — Invited hands-on workshop teaching conference attendees to use instruction-prompting techniques in </w:t>
-      </w:r>
-      <w:proofErr w:type="spellStart"/>
-      <w:r>
-        <w:rPr>
-          <w:rFonts w:ascii="Arial Narrow" w:hAnsi="Arial Narrow"/>
-        </w:rPr>
-        <w:t>Anthropic’s</w:t>
-      </w:r>
-      <w:proofErr w:type="spellEnd"/>
-      <w:r>
-        <w:rPr>
-          <w:rFonts w:ascii="Arial Narrow" w:hAnsi="Arial Narrow"/>
-        </w:rPr>
-        <w:t xml:space="preserve"> Claude to generate interactive semantic-mapping tools for instructional and research use.</w:t>
+        <w:t xml:space="preserve"> — Invited hands-on workshop teaching conference attendees to use instruction-prompting techniques in Anthropic’s Claude to generate interactive semantic-mapping tools for instructional and research use.</w:t>
       </w:r>
     </w:p>
     <w:p>
@@ -1260,6 +1308,25 @@
           <w:rFonts w:ascii="Arial Narrow" w:hAnsi="Arial Narrow"/>
         </w:rPr>
         <w:t>Session presents a scaffolded prompt-engineering framework for student writing, a set of academic-integrity boundary prompts, and reproducible teacher workflows for AI-assisted curriculum development across disciplines.</w:t>
+      </w:r>
+    </w:p>
+    <w:p>
+      <w:pPr>
+        <w:pStyle w:val="ListParagraph"/>
+        <w:numPr>
+          <w:ilvl w:val="0"/>
+          <w:numId w:val="3"/>
+        </w:numPr>
+        <w:spacing w:after="60"/>
+        <w:rPr>
+          <w:rFonts w:ascii="Arial Narrow" w:hAnsi="Arial Narrow"/>
+        </w:rPr>
+      </w:pPr>
+      <w:r>
+        <w:rPr>
+          <w:rFonts w:ascii="Arial Narrow" w:hAnsi="Arial Narrow"/>
+        </w:rPr>
+        <w:t xml:space="preserve">Archived in STARS: https://stars.library.ucf.edu/teaching-and-learning-with-ai/11</w:t>
       </w:r>
     </w:p>
     <w:p>
@@ -1817,6 +1884,25 @@
           <w:rFonts w:ascii="Arial Narrow" w:hAnsi="Arial Narrow"/>
         </w:rPr>
         <w:t>Teacher of the Year (2023) — Calvary Christian Academy</w:t>
+      </w:r>
+    </w:p>
+    <w:p>
+      <w:pPr>
+        <w:pStyle w:val="ListParagraph"/>
+        <w:numPr>
+          <w:ilvl w:val="0"/>
+          <w:numId w:val="2"/>
+        </w:numPr>
+        <w:spacing w:after="60"/>
+        <w:rPr>
+          <w:rFonts w:ascii="Arial Narrow" w:hAnsi="Arial Narrow"/>
+        </w:rPr>
+      </w:pPr>
+      <w:r>
+        <w:rPr>
+          <w:rFonts w:ascii="Arial Narrow" w:hAnsi="Arial Narrow"/>
+        </w:rPr>
+        <w:t xml:space="preserve">Summer Mentoring Fellowship (2024) — University of Central Florida</w:t>
       </w:r>
     </w:p>
     <w:sectPr>

</xml_diff>

<commit_message>
Use plain language throughout the resume
Replaces technical jargon with everyday wording in the resume page
and the Word resume.

Co-Authored-By: Claude Opus 5.5 <noreply@anthropic.com>
Claude-Session: https://claude.ai/code/session_011TbAgz65A3s71tFxu6RsYo
</commit_message>
<xml_diff>
--- a/Angely Suarez Resume 2026.docx
+++ b/Angely Suarez Resume 2026.docx
@@ -31,7 +31,7 @@
         </w:rPr>
         <w:t xml:space="preserve">Kissimmee, FL  •  acsuarez84@hotmail.com  •  </w:t>
       </w:r>
-      <w:hyperlink w:history="1" r:id="rId8hi6brpkqb2w87ngbszq1">
+      <w:hyperlink w:history="1" r:id="rId-qrj2h0ddrr-4dzgelrvj">
         <w:r>
           <w:rPr>
             <w:rStyle w:val="Hyperlink"/>
@@ -56,7 +56,7 @@
         </w:rPr>
         <w:t xml:space="preserve">Portfolio: </w:t>
       </w:r>
-      <w:hyperlink w:history="1" r:id="rIdj_d8ras5unto4ox9xjsvu">
+      <w:hyperlink w:history="1" r:id="rIdw_mlde7i0j8t5caryuejx">
         <w:r>
           <w:rPr>
             <w:rStyle w:val="Hyperlink"/>
@@ -96,7 +96,7 @@
           <w:sz w:val="21"/>
           <w:szCs w:val="21"/>
         </w:rPr>
-        <w:t xml:space="preserve">Educator, researcher, and operations leader working where generative AI, language, and learning meet. Texts &amp; Technology PhD student at the University of Central Florida with hands-on experience evaluating large language models, designing AI-supported instruction, and building interactive digital projects. Brings more than a decade of experience leading classrooms, research teams, and multi-site facilities operations, and translating complex ideas for students, colleagues, and community partners.</w:t>
+        <w:t xml:space="preserve">Educator, researcher, and operations leader working where generative AI, language, and learning meet. Texts &amp; Technology PhD student at the University of Central Florida with hands-on experience testing AI tools like ChatGPT and Claude, using AI to support teaching, and building interactive digital projects. Brings more than a decade of experience leading classrooms, research teams, and multi-site facilities operations, and translating complex ideas for students, colleagues, and community partners.</w:t>
       </w:r>
     </w:p>
     <w:p>
@@ -142,7 +142,7 @@
           <w:sz w:val="21"/>
           <w:szCs w:val="21"/>
         </w:rPr>
-        <w:t xml:space="preserve">LLM evaluation and prompt engineering; AI-assisted (agentic) development; HTML, CSS, JavaScript, p5.js; Git and GitHub Pages</w:t>
+        <w:t xml:space="preserve">Testing and comparing AI tools (ChatGPT, Claude, Gemini); writing effective AI prompts; building web pages and digital projects with AI coding tools; HTML, CSS, and JavaScript basics; publishing work on GitHub</w:t>
       </w:r>
     </w:p>
     <w:p>
@@ -170,7 +170,7 @@
           <w:sz w:val="21"/>
           <w:szCs w:val="21"/>
         </w:rPr>
-        <w:t xml:space="preserve">Curriculum design; scaffolding for multilingual learners; assessment and data-driven instruction; AI integration and academic integrity</w:t>
+        <w:t xml:space="preserve">Curriculum design; supporting multilingual learners; using student data to guide teaching; teaching responsible AI use</w:t>
       </w:r>
     </w:p>
     <w:p>
@@ -198,7 +198,7 @@
           <w:sz w:val="21"/>
           <w:szCs w:val="21"/>
         </w:rPr>
-        <w:t xml:space="preserve">Qualitative and autoethnographic methods; critical discourse analysis; structuring unstructured text data; community-centered research</w:t>
+        <w:t xml:space="preserve">Qualitative research; analyzing how language and images represent people; organizing large collections of text into clear categories; community-centered research</w:t>
       </w:r>
     </w:p>
     <w:p>
@@ -226,7 +226,7 @@
           <w:sz w:val="21"/>
           <w:szCs w:val="21"/>
         </w:rPr>
-        <w:t xml:space="preserve">Team leadership and mentoring; budgeting and vendor management; stakeholder communication; cross-functional coordination</w:t>
+        <w:t xml:space="preserve">Team leadership and mentoring; budgeting and vendor management; clear communication with partners; working across teams</w:t>
       </w:r>
     </w:p>
     <w:p>
@@ -262,25 +262,25 @@
           <w:sz w:val="21"/>
           <w:szCs w:val="21"/>
         </w:rPr>
-        <w:t xml:space="preserve">Presented peer-reviewed research on bias in how LLMs represent Latina women at the Electronic Literature Organization (ELO) 2026 conference, comparing outputs from ChatGPT, Claude, Gemini, and Copilot.</w:t>
-      </w:r>
-    </w:p>
-    <w:p>
-      <w:pPr>
-        <w:pStyle w:val="ListParagraph"/>
-        <w:numPr>
-          <w:ilvl w:val="0"/>
-          <w:numId w:val="2"/>
-        </w:numPr>
-        <w:spacing w:after="40"/>
-      </w:pPr>
-      <w:r>
-        <w:rPr>
-          <w:rFonts w:ascii="Arial Narrow" w:cs="Arial Narrow" w:eastAsia="Arial Narrow" w:hAnsi="Arial Narrow"/>
-          <w:sz w:val="21"/>
-          <w:szCs w:val="21"/>
-        </w:rPr>
-        <w:t xml:space="preserve">Presented an AI prompt-engineering framework for multilingual student writing and teacher planning at UCF’s Teaching and Learning with AI Conference (2026), and facilitated a hands-on Claude station in its AI Playground.</w:t>
+        <w:t xml:space="preserve">Presented peer-reviewed research on bias in how AI tools represent Latina women at the Electronic Literature Organization (ELO) 2026 conference, comparing outputs from ChatGPT, Claude, Gemini, and Copilot.</w:t>
+      </w:r>
+    </w:p>
+    <w:p>
+      <w:pPr>
+        <w:pStyle w:val="ListParagraph"/>
+        <w:numPr>
+          <w:ilvl w:val="0"/>
+          <w:numId w:val="2"/>
+        </w:numPr>
+        <w:spacing w:after="40"/>
+      </w:pPr>
+      <w:r>
+        <w:rPr>
+          <w:rFonts w:ascii="Arial Narrow" w:cs="Arial Narrow" w:eastAsia="Arial Narrow" w:hAnsi="Arial Narrow"/>
+          <w:sz w:val="21"/>
+          <w:szCs w:val="21"/>
+        </w:rPr>
+        <w:t xml:space="preserve">Presented a step-by-step approach for using AI prompts to support multilingual student writing and teacher planning at UCF’s Teaching and Learning with AI Conference (2026), and facilitated a hands-on Claude station in its AI Playground.</w:t>
       </w:r>
     </w:p>
     <w:p>
@@ -411,25 +411,25 @@
           <w:sz w:val="21"/>
           <w:szCs w:val="21"/>
         </w:rPr>
-        <w:t xml:space="preserve">Built a structured mapping of unstructured archival sources by theme, language pattern, and metadata.</w:t>
-      </w:r>
-    </w:p>
-    <w:p>
-      <w:pPr>
-        <w:pStyle w:val="ListParagraph"/>
-        <w:numPr>
-          <w:ilvl w:val="0"/>
-          <w:numId w:val="2"/>
-        </w:numPr>
-        <w:spacing w:after="40"/>
-      </w:pPr>
-      <w:r>
-        <w:rPr>
-          <w:rFonts w:ascii="Arial Narrow" w:cs="Arial Narrow" w:eastAsia="Arial Narrow" w:hAnsi="Arial Narrow"/>
-          <w:sz w:val="21"/>
-          <w:szCs w:val="21"/>
-        </w:rPr>
-        <w:t xml:space="preserve">Work with tribal stakeholders, faculty, and museum staff to align research with community principles of data sovereignty.</w:t>
+        <w:t xml:space="preserve">Organized archival sources into clear categories by theme, language, and source details.</w:t>
+      </w:r>
+    </w:p>
+    <w:p>
+      <w:pPr>
+        <w:pStyle w:val="ListParagraph"/>
+        <w:numPr>
+          <w:ilvl w:val="0"/>
+          <w:numId w:val="2"/>
+        </w:numPr>
+        <w:spacing w:after="40"/>
+      </w:pPr>
+      <w:r>
+        <w:rPr>
+          <w:rFonts w:ascii="Arial Narrow" w:cs="Arial Narrow" w:eastAsia="Arial Narrow" w:hAnsi="Arial Narrow"/>
+          <w:sz w:val="21"/>
+          <w:szCs w:val="21"/>
+        </w:rPr>
+        <w:t xml:space="preserve">Work with tribal partners, faculty, and museum staff so the research follows the community’s own guidelines for how its history and information are used.</w:t>
       </w:r>
     </w:p>
     <w:p>
@@ -506,7 +506,7 @@
           <w:sz w:val="21"/>
           <w:szCs w:val="21"/>
         </w:rPr>
-        <w:t xml:space="preserve">Integrate generative AI into writing instruction using prompt-engineering scaffolds and academic-integrity guidelines.</w:t>
+        <w:t xml:space="preserve">Teach students to use AI responsibly in their writing, with guided prompts and clear academic-integrity rules.</w:t>
       </w:r>
     </w:p>
     <w:p>
@@ -642,7 +642,7 @@
           <w:sz w:val="21"/>
           <w:szCs w:val="21"/>
         </w:rPr>
-        <w:t xml:space="preserve">Led the high school Professional Learning Community, facilitating curriculum alignment and mentoring colleagues.</w:t>
+        <w:t xml:space="preserve">Led the high school teacher team (Professional Learning Community), aligning curriculum and mentoring colleagues.</w:t>
       </w:r>
     </w:p>
     <w:p>
@@ -778,7 +778,7 @@
           <w:sz w:val="21"/>
           <w:szCs w:val="21"/>
         </w:rPr>
-        <w:t xml:space="preserve">Directed multi-site facilities operations, including budgeting, vendor management, and cross-functional coordination.</w:t>
+        <w:t xml:space="preserve">Directed multi-site facilities operations, including budgets, vendors, and coordination across departments.</w:t>
       </w:r>
     </w:p>
     <w:p>
@@ -808,7 +808,7 @@
         </w:numPr>
         <w:spacing w:after="40"/>
       </w:pPr>
-      <w:hyperlink w:history="1" r:id="rId9pey3wvnr6jgubidbhnbb">
+      <w:hyperlink w:history="1" r:id="rIdwxj4xu5l6xk-srcaqdp22">
         <w:r>
           <w:rPr>
             <w:rStyle w:val="Hyperlink"/>
@@ -816,7 +816,7 @@
             <w:sz w:val="21"/>
             <w:szCs w:val="21"/>
           </w:rPr>
-          <w:t xml:space="preserve">LLM Image Interpretation Study</w:t>
+          <w:t xml:space="preserve">AI Image Interpretation Study</w:t>
         </w:r>
       </w:hyperlink>
       <w:r>
@@ -825,19 +825,19 @@
           <w:sz w:val="21"/>
           <w:szCs w:val="21"/>
         </w:rPr>
-        <w:t xml:space="preserve"> — Compared how Translinguo, ChatGPT, and Claude interpret an image given an authorial framework; published as an interactive concept map.</w:t>
-      </w:r>
-    </w:p>
-    <w:p>
-      <w:pPr>
-        <w:pStyle w:val="ListParagraph"/>
-        <w:numPr>
-          <w:ilvl w:val="0"/>
-          <w:numId w:val="2"/>
-        </w:numPr>
-        <w:spacing w:after="40"/>
-      </w:pPr>
-      <w:hyperlink w:history="1" r:id="rIdmuuqhcv3l-kkfwokkk29y">
+        <w:t xml:space="preserve"> — Compared how three AI tools interpret the same photograph; shared the findings as an interactive web map.</w:t>
+      </w:r>
+    </w:p>
+    <w:p>
+      <w:pPr>
+        <w:pStyle w:val="ListParagraph"/>
+        <w:numPr>
+          <w:ilvl w:val="0"/>
+          <w:numId w:val="2"/>
+        </w:numPr>
+        <w:spacing w:after="40"/>
+      </w:pPr>
+      <w:hyperlink w:history="1" r:id="rIdakt-li691bqilse2ewor9">
         <w:r>
           <w:rPr>
             <w:rStyle w:val="Hyperlink"/>
@@ -854,7 +854,7 @@
           <w:sz w:val="21"/>
           <w:szCs w:val="21"/>
         </w:rPr>
-        <w:t xml:space="preserve"> — p5.js generative artwork that turns textile patterns into poetry.</w:t>
+        <w:t xml:space="preserve"> — interactive digital artwork that turns textile patterns into poetry.</w:t>
       </w:r>
     </w:p>
     <w:p>

</xml_diff>